<commit_message>
Actualizacion de propuesta de Modulo de pagos y Envio de cuenta de cobro de Reportes de Inventario y Movimientos
</commit_message>
<xml_diff>
--- a/documentos/RQM API Inventario y Movimientos/Cuenta de cobro Interfaz Inventario y Movimientos.docx
+++ b/documentos/RQM API Inventario y Movimientos/Cuenta de cobro Interfaz Inventario y Movimientos.docx
@@ -363,98 +363,6 @@
         </w:rPr>
         <w:t xml:space="preserve"> SEIS MILLONES NOVECIENTOS MIL PESOS ($6.900.000)</w:t>
       </w:r>
-      <w:r>
-        <w:rPr>
-          <w:rFonts w:ascii="Arial" w:hAnsi="Arial" w:cs="Arial"/>
-        </w:rPr>
-      </w:r>
-      <w:r>
-        <w:rPr>
-          <w:rFonts w:ascii="Arial" w:hAnsi="Arial" w:cs="Arial"/>
-        </w:rPr>
-      </w:r>
-      <w:r>
-        <w:rPr>
-          <w:rFonts w:ascii="Arial" w:hAnsi="Arial" w:cs="Arial"/>
-        </w:rPr>
-      </w:r>
-      <w:r>
-        <w:rPr>
-          <w:rFonts w:ascii="Arial" w:hAnsi="Arial" w:cs="Arial"/>
-        </w:rPr>
-      </w:r>
-      <w:bookmarkStart w:id="0" w:name="_GoBack"/>
-      <w:bookmarkEnd w:id="0"/>
-      <w:r>
-        <w:rPr>
-          <w:rFonts w:ascii="Arial" w:hAnsi="Arial" w:cs="Arial"/>
-        </w:rPr>
-      </w:r>
-      <w:r>
-        <w:rPr>
-          <w:rFonts w:ascii="Arial" w:hAnsi="Arial" w:cs="Arial"/>
-        </w:rPr>
-      </w:r>
-      <w:r>
-        <w:rPr>
-          <w:rFonts w:ascii="Arial" w:hAnsi="Arial" w:cs="Arial"/>
-        </w:rPr>
-      </w:r>
-      <w:r>
-        <w:rPr>
-          <w:rFonts w:ascii="Arial" w:hAnsi="Arial" w:cs="Arial"/>
-        </w:rPr>
-      </w:r>
-      <w:r>
-        <w:rPr>
-          <w:rFonts w:ascii="Arial" w:hAnsi="Arial" w:cs="Arial"/>
-        </w:rPr>
-      </w:r>
-      <w:r>
-        <w:rPr>
-          <w:rFonts w:ascii="Arial" w:hAnsi="Arial" w:cs="Arial"/>
-        </w:rPr>
-      </w:r>
-      <w:r>
-        <w:rPr>
-          <w:rFonts w:ascii="Arial" w:hAnsi="Arial" w:cs="Arial"/>
-        </w:rPr>
-      </w:r>
-      <w:r>
-        <w:rPr>
-          <w:rFonts w:ascii="Arial" w:hAnsi="Arial" w:cs="Arial"/>
-        </w:rPr>
-      </w:r>
-      <w:r>
-        <w:rPr>
-          <w:rFonts w:ascii="Arial" w:hAnsi="Arial" w:cs="Arial"/>
-        </w:rPr>
-      </w:r>
-      <w:r>
-        <w:rPr>
-          <w:rFonts w:ascii="Arial" w:hAnsi="Arial" w:cs="Arial"/>
-        </w:rPr>
-      </w:r>
-      <w:r>
-        <w:rPr>
-          <w:rFonts w:ascii="Arial" w:hAnsi="Arial" w:cs="Arial"/>
-        </w:rPr>
-      </w:r>
-      <w:r>
-        <w:rPr>
-          <w:rFonts w:ascii="Arial" w:hAnsi="Arial" w:cs="Arial"/>
-        </w:rPr>
-      </w:r>
-      <w:r>
-        <w:rPr>
-          <w:rFonts w:ascii="Arial" w:hAnsi="Arial" w:cs="Arial"/>
-        </w:rPr>
-      </w:r>
-      <w:r>
-        <w:rPr>
-          <w:rFonts w:ascii="Arial" w:hAnsi="Arial" w:cs="Arial"/>
-        </w:rPr>
-      </w:r>
     </w:p>
     <w:p>
       <w:pPr>
@@ -497,90 +405,157 @@
           <w:sz w:val="28"/>
           <w:szCs w:val="28"/>
         </w:rPr>
-        <w:t xml:space="preserve"> Entrega final del desarrollo “Interfaz para Consulta de Inventario y Movimientos” (exportación diaria de listados de Pedidos, Inventario y Órdenes de Compra, y Reporte de Artículos y Referencias), según propuesta aprobada del 22 de septiembre de 2026, por valor de $6.000.000; y desarrollos adicionales entregados: (1) Inactivación del Módulo de Asignación Automática de Cantidades a Pedidos Pendientes de Atención, por valor de $400.000, y (2) Control de verificación y cruce de Referencias entre Páginas Promocionales y Aldebaran, por valor de $500.000.</w:t>
-      </w:r>
-      <w:r>
-        <w:rPr>
-          <w:rFonts w:ascii="Arial" w:hAnsi="Arial" w:cs="Arial"/>
-        </w:rPr>
-      </w:r>
-      <w:r>
-        <w:rPr>
-          <w:rFonts w:ascii="Arial" w:hAnsi="Arial" w:cs="Arial"/>
-        </w:rPr>
-      </w:r>
-      <w:r>
-        <w:rPr>
-          <w:rFonts w:ascii="Arial" w:hAnsi="Arial" w:cs="Arial"/>
-        </w:rPr>
-      </w:r>
-      <w:r>
-        <w:rPr>
-          <w:rFonts w:ascii="Arial" w:hAnsi="Arial" w:cs="Arial"/>
-        </w:rPr>
-      </w:r>
-      <w:r>
-        <w:rPr>
-          <w:rFonts w:ascii="Arial" w:hAnsi="Arial" w:cs="Arial"/>
-        </w:rPr>
-      </w:r>
-      <w:r>
-        <w:rPr>
-          <w:rFonts w:ascii="Arial" w:hAnsi="Arial" w:cs="Arial"/>
-        </w:rPr>
-      </w:r>
-      <w:r>
-        <w:rPr>
-          <w:rFonts w:ascii="Arial" w:hAnsi="Arial" w:cs="Arial"/>
-        </w:rPr>
-      </w:r>
-      <w:r>
-        <w:rPr>
-          <w:rFonts w:ascii="Arial" w:hAnsi="Arial" w:cs="Arial"/>
-        </w:rPr>
-      </w:r>
-      <w:r>
-        <w:rPr>
-          <w:rFonts w:ascii="Arial" w:hAnsi="Arial" w:cs="Arial"/>
-        </w:rPr>
-      </w:r>
-      <w:r>
-        <w:rPr>
-          <w:rFonts w:ascii="Arial" w:hAnsi="Arial" w:cs="Arial"/>
-        </w:rPr>
-      </w:r>
-      <w:r>
-        <w:rPr>
-          <w:rFonts w:ascii="Arial" w:hAnsi="Arial" w:cs="Arial"/>
-        </w:rPr>
-      </w:r>
-      <w:r>
-        <w:rPr>
-          <w:rFonts w:ascii="Arial" w:hAnsi="Arial" w:cs="Arial"/>
-        </w:rPr>
-      </w:r>
-      <w:r>
-        <w:rPr>
-          <w:rFonts w:ascii="Arial" w:hAnsi="Arial" w:cs="Arial"/>
-        </w:rPr>
-      </w:r>
-      <w:r>
-        <w:rPr>
-          <w:rFonts w:ascii="Arial" w:hAnsi="Arial" w:cs="Arial"/>
-        </w:rPr>
-      </w:r>
-      <w:r>
-        <w:rPr>
-          <w:rFonts w:ascii="Arial" w:hAnsi="Arial" w:cs="Arial"/>
-        </w:rPr>
-      </w:r>
-      <w:r>
-        <w:rPr>
-          <w:rFonts w:ascii="Arial" w:hAnsi="Arial" w:cs="Arial"/>
-          <w:sz w:val="28"/>
-          <w:szCs w:val="28"/>
-        </w:rPr>
-      </w:r>
+        <w:t xml:space="preserve"> </w:t>
+      </w:r>
+    </w:p>
+    <w:p>
+      <w:pPr>
+        <w:jc w:val="both"/>
+        <w:rPr>
+          <w:rFonts w:ascii="Arial" w:hAnsi="Arial" w:cs="Arial"/>
+          <w:sz w:val="28"/>
+          <w:szCs w:val="28"/>
+        </w:rPr>
+      </w:pPr>
+    </w:p>
+    <w:p>
+      <w:pPr>
+        <w:jc w:val="both"/>
+        <w:rPr>
+          <w:rFonts w:ascii="Arial" w:hAnsi="Arial" w:cs="Arial"/>
+          <w:sz w:val="28"/>
+          <w:szCs w:val="28"/>
+        </w:rPr>
+      </w:pPr>
+      <w:r>
+        <w:rPr>
+          <w:rFonts w:ascii="Arial" w:hAnsi="Arial" w:cs="Arial"/>
+          <w:sz w:val="28"/>
+          <w:szCs w:val="28"/>
+        </w:rPr>
+        <w:t xml:space="preserve">Entrega final del desarrollo “Interfaz para Consulta de Inventario y Movimientos” (exportación diaria de listados de Pedidos, Inventario y Órdenes de Compra, y Reporte de Artículos y Referencias), según propuesta aprobada del 22 de septiembre de 2026, por valor de $6.000.000; </w:t>
+      </w:r>
+    </w:p>
+    <w:p>
+      <w:pPr>
+        <w:jc w:val="both"/>
+        <w:rPr>
+          <w:rFonts w:ascii="Arial" w:hAnsi="Arial" w:cs="Arial"/>
+          <w:sz w:val="28"/>
+          <w:szCs w:val="28"/>
+        </w:rPr>
+      </w:pPr>
+    </w:p>
+    <w:p>
+      <w:pPr>
+        <w:jc w:val="both"/>
+        <w:rPr>
+          <w:rFonts w:ascii="Arial" w:hAnsi="Arial" w:cs="Arial"/>
+          <w:sz w:val="28"/>
+          <w:szCs w:val="28"/>
+        </w:rPr>
+      </w:pPr>
+      <w:r>
+        <w:rPr>
+          <w:rFonts w:ascii="Arial" w:hAnsi="Arial" w:cs="Arial"/>
+          <w:sz w:val="28"/>
+          <w:szCs w:val="28"/>
+        </w:rPr>
+        <w:t>D</w:t>
+      </w:r>
+      <w:r>
+        <w:rPr>
+          <w:rFonts w:ascii="Arial" w:hAnsi="Arial" w:cs="Arial"/>
+          <w:sz w:val="28"/>
+          <w:szCs w:val="28"/>
+        </w:rPr>
+        <w:t xml:space="preserve">esarrollos adicionales entregados: </w:t>
+      </w:r>
+    </w:p>
+    <w:p>
+      <w:pPr>
+        <w:jc w:val="both"/>
+        <w:rPr>
+          <w:rFonts w:ascii="Arial" w:hAnsi="Arial" w:cs="Arial"/>
+          <w:sz w:val="28"/>
+          <w:szCs w:val="28"/>
+        </w:rPr>
+      </w:pPr>
+    </w:p>
+    <w:p>
+      <w:pPr>
+        <w:pStyle w:val="Prrafodelista"/>
+        <w:numPr>
+          <w:ilvl w:val="0"/>
+          <w:numId w:val="2"/>
+        </w:numPr>
+        <w:jc w:val="both"/>
+        <w:rPr>
+          <w:rFonts w:ascii="Arial" w:hAnsi="Arial" w:cs="Arial"/>
+          <w:sz w:val="28"/>
+          <w:szCs w:val="28"/>
+        </w:rPr>
+      </w:pPr>
+      <w:r>
+        <w:rPr>
+          <w:rFonts w:ascii="Arial" w:hAnsi="Arial" w:cs="Arial"/>
+          <w:sz w:val="28"/>
+          <w:szCs w:val="28"/>
+        </w:rPr>
+        <w:t>Inactivación del Módulo de Asignación Automática de Cantidades a Pedidos Pendientes de Atención, por valor de $400.000</w:t>
+      </w:r>
+      <w:r>
+        <w:rPr>
+          <w:rFonts w:ascii="Arial" w:hAnsi="Arial" w:cs="Arial"/>
+          <w:sz w:val="28"/>
+          <w:szCs w:val="28"/>
+        </w:rPr>
+        <w:t>.</w:t>
+      </w:r>
+    </w:p>
+    <w:p>
+      <w:pPr>
+        <w:pStyle w:val="Prrafodelista"/>
+        <w:jc w:val="both"/>
+        <w:rPr>
+          <w:rFonts w:ascii="Arial" w:hAnsi="Arial" w:cs="Arial"/>
+          <w:sz w:val="28"/>
+          <w:szCs w:val="28"/>
+        </w:rPr>
+      </w:pPr>
+    </w:p>
+    <w:p>
+      <w:pPr>
+        <w:pStyle w:val="Prrafodelista"/>
+        <w:numPr>
+          <w:ilvl w:val="0"/>
+          <w:numId w:val="2"/>
+        </w:numPr>
+        <w:jc w:val="both"/>
+        <w:rPr>
+          <w:rFonts w:ascii="Arial" w:hAnsi="Arial" w:cs="Arial"/>
+          <w:sz w:val="28"/>
+          <w:szCs w:val="28"/>
+        </w:rPr>
+      </w:pPr>
+      <w:r>
+        <w:rPr>
+          <w:rFonts w:ascii="Arial" w:hAnsi="Arial" w:cs="Arial"/>
+          <w:sz w:val="28"/>
+          <w:szCs w:val="28"/>
+        </w:rPr>
+        <w:t>Control de verificación y cruce de Referencias entre Páginas Promocionales y Aldebaran, por valor de $500.000.</w:t>
+      </w:r>
+    </w:p>
+    <w:p>
+      <w:pPr>
+        <w:jc w:val="both"/>
+        <w:rPr>
+          <w:rFonts w:ascii="Arial" w:hAnsi="Arial" w:cs="Arial"/>
+          <w:sz w:val="28"/>
+          <w:szCs w:val="28"/>
+        </w:rPr>
+      </w:pPr>
     </w:p>
     <w:p>
       <w:pPr>
@@ -605,6 +580,14 @@
         </w:rPr>
         <w:t>Por favor realizar el pago por transferencia con la siguiente información:</w:t>
       </w:r>
+    </w:p>
+    <w:p>
+      <w:pPr>
+        <w:jc w:val="both"/>
+        <w:rPr>
+          <w:rFonts w:ascii="Arial" w:hAnsi="Arial" w:cs="Arial"/>
+        </w:rPr>
+      </w:pPr>
     </w:p>
     <w:p>
       <w:pPr>
@@ -753,18 +736,6 @@
         <w:jc w:val="both"/>
         <w:rPr>
           <w:rFonts w:ascii="Arial" w:hAnsi="Arial" w:cs="Arial"/>
-          <w:sz w:val="28"/>
-          <w:szCs w:val="28"/>
-        </w:rPr>
-      </w:pPr>
-    </w:p>
-    <w:p>
-      <w:pPr>
-        <w:jc w:val="both"/>
-        <w:rPr>
-          <w:rFonts w:ascii="Arial" w:hAnsi="Arial" w:cs="Arial"/>
-          <w:sz w:val="28"/>
-          <w:szCs w:val="28"/>
         </w:rPr>
       </w:pPr>
     </w:p>
@@ -785,6 +756,7 @@
           <w:szCs w:val="28"/>
           <w:lang w:val="es-CO" w:eastAsia="es-CO"/>
         </w:rPr>
+        <w:lastRenderedPageBreak/>
         <mc:AlternateContent>
           <mc:Choice Requires="wps">
             <w:drawing>
@@ -845,7 +817,7 @@
                                 <wp:inline distT="0" distB="0" distL="0" distR="0" wp14:anchorId="6CFCFBDE" wp14:editId="73C8EEB0">
                                   <wp:extent cx="1524311" cy="3137777"/>
                                   <wp:effectExtent l="0" t="6668" r="0" b="0"/>
-                                  <wp:docPr id="1886176953" name="Picture 1" descr="A signature on a white paper&#10;&#10;Description automatically generated"/>
+                                  <wp:docPr id="1" name="Picture 1" descr="A signature on a white paper&#10;&#10;Description automatically generated"/>
                                   <wp:cNvGraphicFramePr>
                                     <a:graphicFrameLocks xmlns:a="http://schemas.openxmlformats.org/drawingml/2006/main" noChangeAspect="1"/>
                                   </wp:cNvGraphicFramePr>
@@ -1112,7 +1084,30 @@
           <w:rFonts w:ascii="Arial" w:hAnsi="Arial" w:cs="Arial"/>
           <w:szCs w:val="28"/>
         </w:rPr>
-        <w:t xml:space="preserve">c.c. </w:t>
+        <w:t>C</w:t>
+      </w:r>
+      <w:r>
+        <w:rPr>
+          <w:rFonts w:ascii="Arial" w:hAnsi="Arial" w:cs="Arial"/>
+          <w:szCs w:val="28"/>
+        </w:rPr>
+        <w:t>.</w:t>
+      </w:r>
+      <w:r>
+        <w:rPr>
+          <w:rFonts w:ascii="Arial" w:hAnsi="Arial" w:cs="Arial"/>
+          <w:szCs w:val="28"/>
+        </w:rPr>
+        <w:t>C</w:t>
+      </w:r>
+      <w:bookmarkStart w:id="0" w:name="_GoBack"/>
+      <w:bookmarkEnd w:id="0"/>
+      <w:r>
+        <w:rPr>
+          <w:rFonts w:ascii="Arial" w:hAnsi="Arial" w:cs="Arial"/>
+          <w:szCs w:val="28"/>
+        </w:rPr>
+        <w:t xml:space="preserve">. </w:t>
       </w:r>
       <w:r>
         <w:rPr>
@@ -1279,6 +1274,7 @@
       <w:pPr>
         <w:jc w:val="both"/>
         <w:rPr>
+          <w:rFonts w:ascii="Arial" w:hAnsi="Arial" w:cs="Arial"/>
           <w:b/>
           <w:bCs/>
           <w:i/>
@@ -1293,28 +1289,79 @@
           <w:i/>
           <w:sz w:val="20"/>
         </w:rPr>
-        <w:t xml:space="preserve">Para efectos de la retención en la fuente certifico bajo la gravedad de juramento que mis ingresos están clasificados como rentas de trabajo y no tengo empleados a cargo. </w:t>
-      </w:r>
-    </w:p>
-    <w:p>
-      <w:pPr>
-        <w:jc w:val="both"/>
-        <w:rPr>
+        <w:t>Modalidad: desarrollo de software por entregables a precio fijo, ejecutado con medios propios, de forma autónoma y sin subordinación (actividad económica CIIU 6201). Los aportes a seguridad social se liquidan como trabajador independiente por cuenta propia, aplicando el esquema de presunción de costos de la UGPP (Resolución 532 de 2024 y Decreto 379 de 2026)</w:t>
+      </w:r>
+      <w:r>
+        <w:rPr>
+          <w:rFonts w:ascii="Arial" w:hAnsi="Arial" w:cs="Arial"/>
           <w:b/>
           <w:bCs/>
           <w:i/>
           <w:sz w:val="20"/>
         </w:rPr>
-      </w:pPr>
-      <w:r>
-        <w:rPr>
-          <w:rFonts w:ascii="Arial" w:hAnsi="Arial" w:cs="Arial"/>
+        <w:t>.</w:t>
+      </w:r>
+    </w:p>
+    <w:p>
+      <w:pPr>
+        <w:jc w:val="both"/>
+        <w:rPr>
           <w:b/>
           <w:bCs/>
           <w:i/>
           <w:sz w:val="20"/>
         </w:rPr>
-        <w:t>Anexo: planilla de aportes a seguridad social (salud y pensión) del periodo septiembre de 2026.</w:t>
+      </w:pPr>
+      <w:r>
+        <w:rPr>
+          <w:rFonts w:ascii="Arial" w:hAnsi="Arial" w:cs="Arial"/>
+          <w:b/>
+          <w:bCs/>
+          <w:i/>
+          <w:sz w:val="20"/>
+        </w:rPr>
+        <w:t xml:space="preserve">Para efectos de la retención en la fuente certifico bajo la gravedad de juramento que mis ingresos están clasificados como rentas de trabajo y no tengo empleados a cargo. </w:t>
+      </w:r>
+    </w:p>
+    <w:p>
+      <w:pPr>
+        <w:jc w:val="both"/>
+        <w:rPr>
+          <w:b/>
+          <w:bCs/>
+          <w:i/>
+          <w:sz w:val="20"/>
+        </w:rPr>
+      </w:pPr>
+      <w:r>
+        <w:rPr>
+          <w:rFonts w:ascii="Arial" w:hAnsi="Arial" w:cs="Arial"/>
+          <w:b/>
+          <w:bCs/>
+          <w:i/>
+          <w:sz w:val="20"/>
+        </w:rPr>
+        <w:t>Anexo: planilla de aportes a seguridad social (salud y pensión) del periodo septiembre de 2026</w:t>
+      </w:r>
+      <w:r>
+        <w:rPr>
+          <w:rFonts w:ascii="Arial" w:hAnsi="Arial" w:cs="Arial"/>
+          <w:b/>
+          <w:bCs/>
+          <w:i/>
+          <w:sz w:val="20"/>
+        </w:rPr>
+        <w:t xml:space="preserve"> No. 87824761 y corrección No. 88419068</w:t>
+      </w:r>
+      <w:r>
+        <w:rPr>
+          <w:rFonts w:ascii="Arial" w:hAnsi="Arial" w:cs="Arial"/>
+          <w:b/>
+          <w:bCs/>
+          <w:i/>
+          <w:sz w:val="20"/>
+        </w:rPr>
+        <w:t>.</w:t>
       </w:r>
     </w:p>
     <w:sectPr>
@@ -1442,8 +1489,123 @@
       </w:rPr>
     </w:lvl>
   </w:abstractNum>
+  <w:abstractNum w:abstractNumId="1" w15:restartNumberingAfterBreak="0">
+    <w:nsid w:val="77490209"/>
+    <w:multiLevelType w:val="hybridMultilevel"/>
+    <w:tmpl w:val="A86A95B8"/>
+    <w:lvl w:ilvl="0" w:tplc="C7EEA8DC">
+      <w:numFmt w:val="bullet"/>
+      <w:lvlText w:val="-"/>
+      <w:lvlJc w:val="left"/>
+      <w:pPr>
+        <w:ind w:left="720" w:hanging="360"/>
+      </w:pPr>
+      <w:rPr>
+        <w:rFonts w:ascii="Arial" w:eastAsia="Times New Roman" w:hAnsi="Arial" w:cs="Arial" w:hint="default"/>
+      </w:rPr>
+    </w:lvl>
+    <w:lvl w:ilvl="1" w:tplc="240A0003" w:tentative="1">
+      <w:start w:val="1"/>
+      <w:numFmt w:val="bullet"/>
+      <w:lvlText w:val="o"/>
+      <w:lvlJc w:val="left"/>
+      <w:pPr>
+        <w:ind w:left="1440" w:hanging="360"/>
+      </w:pPr>
+      <w:rPr>
+        <w:rFonts w:ascii="Courier New" w:hAnsi="Courier New" w:cs="Courier New" w:hint="default"/>
+      </w:rPr>
+    </w:lvl>
+    <w:lvl w:ilvl="2" w:tplc="240A0005" w:tentative="1">
+      <w:start w:val="1"/>
+      <w:numFmt w:val="bullet"/>
+      <w:lvlText w:val=""/>
+      <w:lvlJc w:val="left"/>
+      <w:pPr>
+        <w:ind w:left="2160" w:hanging="360"/>
+      </w:pPr>
+      <w:rPr>
+        <w:rFonts w:ascii="Wingdings" w:hAnsi="Wingdings" w:hint="default"/>
+      </w:rPr>
+    </w:lvl>
+    <w:lvl w:ilvl="3" w:tplc="240A0001" w:tentative="1">
+      <w:start w:val="1"/>
+      <w:numFmt w:val="bullet"/>
+      <w:lvlText w:val=""/>
+      <w:lvlJc w:val="left"/>
+      <w:pPr>
+        <w:ind w:left="2880" w:hanging="360"/>
+      </w:pPr>
+      <w:rPr>
+        <w:rFonts w:ascii="Symbol" w:hAnsi="Symbol" w:hint="default"/>
+      </w:rPr>
+    </w:lvl>
+    <w:lvl w:ilvl="4" w:tplc="240A0003" w:tentative="1">
+      <w:start w:val="1"/>
+      <w:numFmt w:val="bullet"/>
+      <w:lvlText w:val="o"/>
+      <w:lvlJc w:val="left"/>
+      <w:pPr>
+        <w:ind w:left="3600" w:hanging="360"/>
+      </w:pPr>
+      <w:rPr>
+        <w:rFonts w:ascii="Courier New" w:hAnsi="Courier New" w:cs="Courier New" w:hint="default"/>
+      </w:rPr>
+    </w:lvl>
+    <w:lvl w:ilvl="5" w:tplc="240A0005" w:tentative="1">
+      <w:start w:val="1"/>
+      <w:numFmt w:val="bullet"/>
+      <w:lvlText w:val=""/>
+      <w:lvlJc w:val="left"/>
+      <w:pPr>
+        <w:ind w:left="4320" w:hanging="360"/>
+      </w:pPr>
+      <w:rPr>
+        <w:rFonts w:ascii="Wingdings" w:hAnsi="Wingdings" w:hint="default"/>
+      </w:rPr>
+    </w:lvl>
+    <w:lvl w:ilvl="6" w:tplc="240A0001" w:tentative="1">
+      <w:start w:val="1"/>
+      <w:numFmt w:val="bullet"/>
+      <w:lvlText w:val=""/>
+      <w:lvlJc w:val="left"/>
+      <w:pPr>
+        <w:ind w:left="5040" w:hanging="360"/>
+      </w:pPr>
+      <w:rPr>
+        <w:rFonts w:ascii="Symbol" w:hAnsi="Symbol" w:hint="default"/>
+      </w:rPr>
+    </w:lvl>
+    <w:lvl w:ilvl="7" w:tplc="240A0003" w:tentative="1">
+      <w:start w:val="1"/>
+      <w:numFmt w:val="bullet"/>
+      <w:lvlText w:val="o"/>
+      <w:lvlJc w:val="left"/>
+      <w:pPr>
+        <w:ind w:left="5760" w:hanging="360"/>
+      </w:pPr>
+      <w:rPr>
+        <w:rFonts w:ascii="Courier New" w:hAnsi="Courier New" w:cs="Courier New" w:hint="default"/>
+      </w:rPr>
+    </w:lvl>
+    <w:lvl w:ilvl="8" w:tplc="240A0005" w:tentative="1">
+      <w:start w:val="1"/>
+      <w:numFmt w:val="bullet"/>
+      <w:lvlText w:val=""/>
+      <w:lvlJc w:val="left"/>
+      <w:pPr>
+        <w:ind w:left="6480" w:hanging="360"/>
+      </w:pPr>
+      <w:rPr>
+        <w:rFonts w:ascii="Wingdings" w:hAnsi="Wingdings" w:hint="default"/>
+      </w:rPr>
+    </w:lvl>
+  </w:abstractNum>
   <w:num w:numId="1">
     <w:abstractNumId w:val="0"/>
+  </w:num>
+  <w:num w:numId="2">
+    <w:abstractNumId w:val="1"/>
   </w:num>
 </w:numbering>
 </file>

</xml_diff>